<commit_message>
Complete SignSpeak AI v1.0: HF ArSL data, trained models, single-port UI.
Fetch ArSL2018 from Hugging Face, train MLP and MobileNet checkpoints,
add evaluation charts, regenerate report/slides, and serve the Next.js
frontend and FastAPI backend together on port 8000 via run_app.ps1.

Co-authored-by: Cursor <cursoragent@cursor.com>
</commit_message>
<xml_diff>
--- a/report/SignSpeak_AI_Report.docx
+++ b/report/SignSpeak_AI_Report.docx
@@ -920,13 +920,55 @@
       </w:r>
     </w:p>
     <w:p>
+      <w:pPr>
+        <w:jc w:val="center"/>
+      </w:pPr>
+      <w:r>
+        <w:drawing>
+          <wp:inline xmlns:a="http://schemas.openxmlformats.org/drawingml/2006/main" xmlns:pic="http://schemas.openxmlformats.org/drawingml/2006/picture">
+            <wp:extent cx="5760000" cy="1920000"/>
+            <wp:docPr id="2" name="Picture 2"/>
+            <wp:cNvGraphicFramePr>
+              <a:graphicFrameLocks noChangeAspect="1"/>
+            </wp:cNvGraphicFramePr>
+            <a:graphic>
+              <a:graphicData uri="http://schemas.openxmlformats.org/drawingml/2006/picture">
+                <pic:pic>
+                  <pic:nvPicPr>
+                    <pic:cNvPr id="0" name="training_curves.png"/>
+                    <pic:cNvPicPr/>
+                  </pic:nvPicPr>
+                  <pic:blipFill>
+                    <a:blip r:embed="rId10"/>
+                    <a:stretch>
+                      <a:fillRect/>
+                    </a:stretch>
+                  </pic:blipFill>
+                  <pic:spPr>
+                    <a:xfrm>
+                      <a:off x="0" y="0"/>
+                      <a:ext cx="5760000" cy="1920000"/>
+                    </a:xfrm>
+                    <a:prstGeom prst="rect"/>
+                  </pic:spPr>
+                </pic:pic>
+              </a:graphicData>
+            </a:graphic>
+          </wp:inline>
+        </w:drawing>
+      </w:r>
+    </w:p>
+    <w:p>
+      <w:pPr>
+        <w:jc w:val="center"/>
+      </w:pPr>
       <w:r>
         <w:rPr>
           <w:b w:val="0"/>
           <w:i/>
-          <w:sz w:val="22"/>
+          <w:sz w:val="20"/>
         </w:rPr>
-        <w:t>[Figure to be inserted: training_curves.png - regenerate after training]</w:t>
+        <w:t>Figure 2: Training and validation accuracy/loss for both classifiers.</w:t>
       </w:r>
     </w:p>
     <w:p>
@@ -940,16 +982,197 @@
         <w:t>4.2 Accuracy by language</w:t>
       </w:r>
     </w:p>
-    <w:p>
-      <w:r>
-        <w:rPr>
-          <w:b w:val="0"/>
-          <w:i/>
-          <w:sz w:val="22"/>
-        </w:rPr>
-        <w:t>[Accuracy table to be inserted after training]</w:t>
-      </w:r>
-    </w:p>
+    <w:tbl>
+      <w:tblPr>
+        <w:tblStyle w:val="LightGrid-Accent1"/>
+        <w:tblW w:type="auto" w:w="0"/>
+        <w:tblLook w:firstColumn="1" w:firstRow="1" w:lastColumn="0" w:lastRow="0" w:noHBand="0" w:noVBand="1" w:val="04A0"/>
+      </w:tblPr>
+      <w:tblGrid>
+        <w:gridCol w:w="2880"/>
+        <w:gridCol w:w="2880"/>
+        <w:gridCol w:w="2880"/>
+      </w:tblGrid>
+      <w:tr>
+        <w:tc>
+          <w:tcPr>
+            <w:tcW w:type="dxa" w:w="3118"/>
+            <w:vAlign w:val="center"/>
+          </w:tcPr>
+          <w:p>
+            <w:r>
+              <w:rPr>
+                <w:b/>
+                <w:sz w:val="20"/>
+              </w:rPr>
+              <w:t>Subset</w:t>
+            </w:r>
+          </w:p>
+        </w:tc>
+        <w:tc>
+          <w:tcPr>
+            <w:tcW w:type="dxa" w:w="1984"/>
+            <w:vAlign w:val="center"/>
+          </w:tcPr>
+          <w:p>
+            <w:r>
+              <w:rPr>
+                <w:b/>
+                <w:sz w:val="20"/>
+              </w:rPr>
+              <w:t>Accuracy</w:t>
+            </w:r>
+          </w:p>
+        </w:tc>
+        <w:tc>
+          <w:tcPr>
+            <w:tcW w:type="dxa" w:w="1701"/>
+            <w:vAlign w:val="center"/>
+          </w:tcPr>
+          <w:p>
+            <w:r>
+              <w:rPr>
+                <w:b/>
+                <w:sz w:val="20"/>
+              </w:rPr>
+              <w:t>N</w:t>
+            </w:r>
+          </w:p>
+        </w:tc>
+      </w:tr>
+      <w:tr>
+        <w:tc>
+          <w:tcPr>
+            <w:tcW w:type="dxa" w:w="3118"/>
+            <w:vAlign w:val="center"/>
+          </w:tcPr>
+          <w:p>
+            <w:r>
+              <w:rPr>
+                <w:sz w:val="20"/>
+              </w:rPr>
+              <w:t>Overall (ASL + ArSL)</w:t>
+            </w:r>
+          </w:p>
+        </w:tc>
+        <w:tc>
+          <w:tcPr>
+            <w:tcW w:type="dxa" w:w="1984"/>
+            <w:vAlign w:val="center"/>
+          </w:tcPr>
+          <w:p>
+            <w:r>
+              <w:rPr>
+                <w:sz w:val="20"/>
+              </w:rPr>
+              <w:t>0.9888</w:t>
+            </w:r>
+          </w:p>
+        </w:tc>
+        <w:tc>
+          <w:tcPr>
+            <w:tcW w:type="dxa" w:w="1701"/>
+            <w:vAlign w:val="center"/>
+          </w:tcPr>
+          <w:p>
+            <w:r>
+              <w:rPr>
+                <w:sz w:val="20"/>
+              </w:rPr>
+              <w:t>1431</w:t>
+            </w:r>
+          </w:p>
+        </w:tc>
+      </w:tr>
+      <w:tr>
+        <w:tc>
+          <w:tcPr>
+            <w:tcW w:type="dxa" w:w="3118"/>
+            <w:vAlign w:val="center"/>
+          </w:tcPr>
+          <w:p>
+            <w:r>
+              <w:rPr>
+                <w:sz w:val="20"/>
+              </w:rPr>
+              <w:t>ASL only</w:t>
+            </w:r>
+          </w:p>
+        </w:tc>
+        <w:tc>
+          <w:tcPr>
+            <w:tcW w:type="dxa" w:w="1984"/>
+            <w:vAlign w:val="center"/>
+          </w:tcPr>
+          <w:p>
+            <w:r>
+              <w:rPr>
+                <w:sz w:val="20"/>
+              </w:rPr>
+              <w:t>0.9930</w:t>
+            </w:r>
+          </w:p>
+        </w:tc>
+        <w:tc>
+          <w:tcPr>
+            <w:tcW w:type="dxa" w:w="1701"/>
+            <w:vAlign w:val="center"/>
+          </w:tcPr>
+          <w:p>
+            <w:r>
+              <w:rPr>
+                <w:sz w:val="20"/>
+              </w:rPr>
+              <w:t>1421</w:t>
+            </w:r>
+          </w:p>
+        </w:tc>
+      </w:tr>
+      <w:tr>
+        <w:tc>
+          <w:tcPr>
+            <w:tcW w:type="dxa" w:w="3118"/>
+            <w:vAlign w:val="center"/>
+          </w:tcPr>
+          <w:p>
+            <w:r>
+              <w:rPr>
+                <w:sz w:val="20"/>
+              </w:rPr>
+              <w:t>ArSL only</w:t>
+            </w:r>
+          </w:p>
+        </w:tc>
+        <w:tc>
+          <w:tcPr>
+            <w:tcW w:type="dxa" w:w="1984"/>
+            <w:vAlign w:val="center"/>
+          </w:tcPr>
+          <w:p>
+            <w:r>
+              <w:rPr>
+                <w:sz w:val="20"/>
+              </w:rPr>
+              <w:t>0.4000</w:t>
+            </w:r>
+          </w:p>
+        </w:tc>
+        <w:tc>
+          <w:tcPr>
+            <w:tcW w:type="dxa" w:w="1701"/>
+            <w:vAlign w:val="center"/>
+          </w:tcPr>
+          <w:p>
+            <w:r>
+              <w:rPr>
+                <w:sz w:val="20"/>
+              </w:rPr>
+              <w:t>10</w:t>
+            </w:r>
+          </w:p>
+        </w:tc>
+      </w:tr>
+    </w:tbl>
     <w:p>
       <w:pPr>
         <w:pStyle w:val="Heading2"/>
@@ -972,23 +1195,107 @@
       </w:r>
     </w:p>
     <w:p>
+      <w:pPr>
+        <w:jc w:val="center"/>
+      </w:pPr>
+      <w:r>
+        <w:drawing>
+          <wp:inline xmlns:a="http://schemas.openxmlformats.org/drawingml/2006/main" xmlns:pic="http://schemas.openxmlformats.org/drawingml/2006/picture">
+            <wp:extent cx="5400000" cy="4800000"/>
+            <wp:docPr id="3" name="Picture 3"/>
+            <wp:cNvGraphicFramePr>
+              <a:graphicFrameLocks noChangeAspect="1"/>
+            </wp:cNvGraphicFramePr>
+            <a:graphic>
+              <a:graphicData uri="http://schemas.openxmlformats.org/drawingml/2006/picture">
+                <pic:pic>
+                  <pic:nvPicPr>
+                    <pic:cNvPr id="0" name="confusion_matrix_asl.png"/>
+                    <pic:cNvPicPr/>
+                  </pic:nvPicPr>
+                  <pic:blipFill>
+                    <a:blip r:embed="rId11"/>
+                    <a:stretch>
+                      <a:fillRect/>
+                    </a:stretch>
+                  </pic:blipFill>
+                  <pic:spPr>
+                    <a:xfrm>
+                      <a:off x="0" y="0"/>
+                      <a:ext cx="5400000" cy="4800000"/>
+                    </a:xfrm>
+                    <a:prstGeom prst="rect"/>
+                  </pic:spPr>
+                </pic:pic>
+              </a:graphicData>
+            </a:graphic>
+          </wp:inline>
+        </w:drawing>
+      </w:r>
+    </w:p>
+    <w:p>
+      <w:pPr>
+        <w:jc w:val="center"/>
+      </w:pPr>
       <w:r>
         <w:rPr>
           <w:b w:val="0"/>
           <w:i/>
-          <w:sz w:val="22"/>
+          <w:sz w:val="20"/>
         </w:rPr>
-        <w:t>[Figure to be inserted: confusion_matrix_asl.png - regenerate after training]</w:t>
+        <w:t>Figure 3: Confusion matrix - ASL letters (row-normalised).</w:t>
       </w:r>
     </w:p>
     <w:p>
+      <w:pPr>
+        <w:jc w:val="center"/>
+      </w:pPr>
+      <w:r>
+        <w:drawing>
+          <wp:inline xmlns:a="http://schemas.openxmlformats.org/drawingml/2006/main" xmlns:pic="http://schemas.openxmlformats.org/drawingml/2006/picture">
+            <wp:extent cx="5400000" cy="4320000"/>
+            <wp:docPr id="4" name="Picture 4"/>
+            <wp:cNvGraphicFramePr>
+              <a:graphicFrameLocks noChangeAspect="1"/>
+            </wp:cNvGraphicFramePr>
+            <a:graphic>
+              <a:graphicData uri="http://schemas.openxmlformats.org/drawingml/2006/picture">
+                <pic:pic>
+                  <pic:nvPicPr>
+                    <pic:cNvPr id="0" name="confusion_matrix_arsl.png"/>
+                    <pic:cNvPicPr/>
+                  </pic:nvPicPr>
+                  <pic:blipFill>
+                    <a:blip r:embed="rId12"/>
+                    <a:stretch>
+                      <a:fillRect/>
+                    </a:stretch>
+                  </pic:blipFill>
+                  <pic:spPr>
+                    <a:xfrm>
+                      <a:off x="0" y="0"/>
+                      <a:ext cx="5400000" cy="4320000"/>
+                    </a:xfrm>
+                    <a:prstGeom prst="rect"/>
+                  </pic:spPr>
+                </pic:pic>
+              </a:graphicData>
+            </a:graphic>
+          </wp:inline>
+        </w:drawing>
+      </w:r>
+    </w:p>
+    <w:p>
+      <w:pPr>
+        <w:jc w:val="center"/>
+      </w:pPr>
       <w:r>
         <w:rPr>
           <w:b w:val="0"/>
           <w:i/>
-          <w:sz w:val="22"/>
+          <w:sz w:val="20"/>
         </w:rPr>
-        <w:t>[Figure to be inserted: confusion_matrix_arsl.png - regenerate after training]</w:t>
+        <w:t>Figure 4: Confusion matrix - ArSL letters (row-normalised).</w:t>
       </w:r>
     </w:p>
     <w:p>
@@ -1012,16 +1319,169 @@
         <w:t>Latency and throughput are measured by `ml/scripts/evaluate.py` on a synthetic 640x480 frame across 30 iterations after warmup. Per-stage timings come from the Stopwatch instrumentation embedded in the pipeline itself.</w:t>
       </w:r>
     </w:p>
-    <w:p>
-      <w:r>
-        <w:rPr>
-          <w:b w:val="0"/>
-          <w:i/>
-          <w:sz w:val="22"/>
-        </w:rPr>
-        <w:t>[FPS / latency table to be inserted after evaluation]</w:t>
-      </w:r>
-    </w:p>
+    <w:tbl>
+      <w:tblPr>
+        <w:tblStyle w:val="LightGrid-Accent1"/>
+        <w:tblW w:type="auto" w:w="0"/>
+        <w:tblLook w:firstColumn="1" w:firstRow="1" w:lastColumn="0" w:lastRow="0" w:noHBand="0" w:noVBand="1" w:val="04A0"/>
+      </w:tblPr>
+      <w:tblGrid>
+        <w:gridCol w:w="4320"/>
+        <w:gridCol w:w="4320"/>
+      </w:tblGrid>
+      <w:tr>
+        <w:tc>
+          <w:tcPr>
+            <w:tcW w:type="dxa" w:w="4535"/>
+            <w:vAlign w:val="center"/>
+          </w:tcPr>
+          <w:p>
+            <w:r>
+              <w:rPr>
+                <w:b/>
+                <w:sz w:val="20"/>
+              </w:rPr>
+              <w:t>Metric</w:t>
+            </w:r>
+          </w:p>
+        </w:tc>
+        <w:tc>
+          <w:tcPr>
+            <w:tcW w:type="dxa" w:w="2268"/>
+            <w:vAlign w:val="center"/>
+          </w:tcPr>
+          <w:p>
+            <w:r>
+              <w:rPr>
+                <w:b/>
+                <w:sz w:val="20"/>
+              </w:rPr>
+              <w:t>Value</w:t>
+            </w:r>
+          </w:p>
+        </w:tc>
+      </w:tr>
+      <w:tr>
+        <w:tc>
+          <w:tcPr>
+            <w:tcW w:type="dxa" w:w="4535"/>
+            <w:vAlign w:val="center"/>
+          </w:tcPr>
+          <w:p>
+            <w:r>
+              <w:rPr>
+                <w:sz w:val="20"/>
+              </w:rPr>
+              <w:t>Mean latency ms</w:t>
+            </w:r>
+          </w:p>
+        </w:tc>
+        <w:tc>
+          <w:tcPr>
+            <w:tcW w:type="dxa" w:w="2268"/>
+            <w:vAlign w:val="center"/>
+          </w:tcPr>
+          <w:p>
+            <w:r>
+              <w:rPr>
+                <w:sz w:val="20"/>
+              </w:rPr>
+              <w:t>42.28</w:t>
+            </w:r>
+          </w:p>
+        </w:tc>
+      </w:tr>
+      <w:tr>
+        <w:tc>
+          <w:tcPr>
+            <w:tcW w:type="dxa" w:w="4535"/>
+            <w:vAlign w:val="center"/>
+          </w:tcPr>
+          <w:p>
+            <w:r>
+              <w:rPr>
+                <w:sz w:val="20"/>
+              </w:rPr>
+              <w:t>P95 latency ms</w:t>
+            </w:r>
+          </w:p>
+        </w:tc>
+        <w:tc>
+          <w:tcPr>
+            <w:tcW w:type="dxa" w:w="2268"/>
+            <w:vAlign w:val="center"/>
+          </w:tcPr>
+          <w:p>
+            <w:r>
+              <w:rPr>
+                <w:sz w:val="20"/>
+              </w:rPr>
+              <w:t>73.26</w:t>
+            </w:r>
+          </w:p>
+        </w:tc>
+      </w:tr>
+      <w:tr>
+        <w:tc>
+          <w:tcPr>
+            <w:tcW w:type="dxa" w:w="4535"/>
+            <w:vAlign w:val="center"/>
+          </w:tcPr>
+          <w:p>
+            <w:r>
+              <w:rPr>
+                <w:sz w:val="20"/>
+              </w:rPr>
+              <w:t>FPS (sustained)</w:t>
+            </w:r>
+          </w:p>
+        </w:tc>
+        <w:tc>
+          <w:tcPr>
+            <w:tcW w:type="dxa" w:w="2268"/>
+            <w:vAlign w:val="center"/>
+          </w:tcPr>
+          <w:p>
+            <w:r>
+              <w:rPr>
+                <w:sz w:val="20"/>
+              </w:rPr>
+              <w:t>23.65</w:t>
+            </w:r>
+          </w:p>
+        </w:tc>
+      </w:tr>
+      <w:tr>
+        <w:tc>
+          <w:tcPr>
+            <w:tcW w:type="dxa" w:w="4535"/>
+            <w:vAlign w:val="center"/>
+          </w:tcPr>
+          <w:p>
+            <w:r>
+              <w:rPr>
+                <w:sz w:val="20"/>
+              </w:rPr>
+              <w:t>Frames measured</w:t>
+            </w:r>
+          </w:p>
+        </w:tc>
+        <w:tc>
+          <w:tcPr>
+            <w:tcW w:type="dxa" w:w="2268"/>
+            <w:vAlign w:val="center"/>
+          </w:tcPr>
+          <w:p>
+            <w:r>
+              <w:rPr>
+                <w:sz w:val="20"/>
+              </w:rPr>
+              <w:t>30</w:t>
+            </w:r>
+          </w:p>
+        </w:tc>
+      </w:tr>
+    </w:tbl>
     <w:p>
       <w:pPr>
         <w:pStyle w:val="Heading2"/>
@@ -1043,16 +1503,139 @@
         <w:t>To justify the design choices we ran three ablations on the landmark MLP. The first uses the full normalised landmarks; the second zeros out the z (depth) component to simulate a system that only had access to a 2D detector; the third adds 3% Gaussian noise to every coordinate to simulate the noise budget of an off-the-shelf cheap webcam.</w:t>
       </w:r>
     </w:p>
-    <w:p>
-      <w:r>
-        <w:rPr>
-          <w:b w:val="0"/>
-          <w:i/>
-          <w:sz w:val="22"/>
-        </w:rPr>
-        <w:t>[Ablation table to be inserted after evaluation]</w:t>
-      </w:r>
-    </w:p>
+    <w:tbl>
+      <w:tblPr>
+        <w:tblStyle w:val="LightGrid-Accent1"/>
+        <w:tblW w:type="auto" w:w="0"/>
+        <w:tblLook w:firstColumn="1" w:firstRow="1" w:lastColumn="0" w:lastRow="0" w:noHBand="0" w:noVBand="1" w:val="04A0"/>
+      </w:tblPr>
+      <w:tblGrid>
+        <w:gridCol w:w="4320"/>
+        <w:gridCol w:w="4320"/>
+      </w:tblGrid>
+      <w:tr>
+        <w:tc>
+          <w:tcPr>
+            <w:tcW w:type="dxa" w:w="5102"/>
+            <w:vAlign w:val="center"/>
+          </w:tcPr>
+          <w:p>
+            <w:r>
+              <w:rPr>
+                <w:b/>
+                <w:sz w:val="20"/>
+              </w:rPr>
+              <w:t>Variant</w:t>
+            </w:r>
+          </w:p>
+        </w:tc>
+        <w:tc>
+          <w:tcPr>
+            <w:tcW w:type="dxa" w:w="2268"/>
+            <w:vAlign w:val="center"/>
+          </w:tcPr>
+          <w:p>
+            <w:r>
+              <w:rPr>
+                <w:b/>
+                <w:sz w:val="20"/>
+              </w:rPr>
+              <w:t>Accuracy</w:t>
+            </w:r>
+          </w:p>
+        </w:tc>
+      </w:tr>
+      <w:tr>
+        <w:tc>
+          <w:tcPr>
+            <w:tcW w:type="dxa" w:w="5102"/>
+            <w:vAlign w:val="center"/>
+          </w:tcPr>
+          <w:p>
+            <w:r>
+              <w:rPr>
+                <w:sz w:val="20"/>
+              </w:rPr>
+              <w:t>Landmark MLP (baseline)</w:t>
+            </w:r>
+          </w:p>
+        </w:tc>
+        <w:tc>
+          <w:tcPr>
+            <w:tcW w:type="dxa" w:w="2268"/>
+            <w:vAlign w:val="center"/>
+          </w:tcPr>
+          <w:p>
+            <w:r>
+              <w:rPr>
+                <w:sz w:val="20"/>
+              </w:rPr>
+              <w:t>0.9888</w:t>
+            </w:r>
+          </w:p>
+        </w:tc>
+      </w:tr>
+      <w:tr>
+        <w:tc>
+          <w:tcPr>
+            <w:tcW w:type="dxa" w:w="5102"/>
+            <w:vAlign w:val="center"/>
+          </w:tcPr>
+          <w:p>
+            <w:r>
+              <w:rPr>
+                <w:sz w:val="20"/>
+              </w:rPr>
+              <w:t>Landmark MLP (z=0)</w:t>
+            </w:r>
+          </w:p>
+        </w:tc>
+        <w:tc>
+          <w:tcPr>
+            <w:tcW w:type="dxa" w:w="2268"/>
+            <w:vAlign w:val="center"/>
+          </w:tcPr>
+          <w:p>
+            <w:r>
+              <w:rPr>
+                <w:sz w:val="20"/>
+              </w:rPr>
+              <w:t>0.9483</w:t>
+            </w:r>
+          </w:p>
+        </w:tc>
+      </w:tr>
+      <w:tr>
+        <w:tc>
+          <w:tcPr>
+            <w:tcW w:type="dxa" w:w="5102"/>
+            <w:vAlign w:val="center"/>
+          </w:tcPr>
+          <w:p>
+            <w:r>
+              <w:rPr>
+                <w:sz w:val="20"/>
+              </w:rPr>
+              <w:t>Landmark MLP + 3% noise</w:t>
+            </w:r>
+          </w:p>
+        </w:tc>
+        <w:tc>
+          <w:tcPr>
+            <w:tcW w:type="dxa" w:w="2268"/>
+            <w:vAlign w:val="center"/>
+          </w:tcPr>
+          <w:p>
+            <w:r>
+              <w:rPr>
+                <w:sz w:val="20"/>
+              </w:rPr>
+              <w:t>0.9839</w:t>
+            </w:r>
+          </w:p>
+        </w:tc>
+      </w:tr>
+    </w:tbl>
     <w:p>
       <w:pPr>
         <w:pStyle w:val="Heading2"/>
@@ -1771,7 +2354,7 @@
           <w:i w:val="0"/>
           <w:sz w:val="20"/>
         </w:rPr>
-        <w:t>G. Latif, N. Mohammad, J. Alghazo, R. AlKhalaf, and R. AlKhalaf, "ArASL: Arabic Alphabets Sign Language Dataset," Data in Brief, vol. 23, art. 103777, 2019.</w:t>
+        <w:t>G. Latif, N. Mohammad, J. Alghazo, R. AlKhalaf, and R. AlKhalaf, "ArASL: Arabic Alphabets Sign Language Dataset," Data in Brief, vol. 23, art. 103777, 2019. [Online]. Available: https://huggingface.co/datasets/pain/ArASL_Database_Grayscale</w:t>
       </w:r>
     </w:p>
     <w:p>

</xml_diff>